<commit_message>
Problem Statement Docs updated
</commit_message>
<xml_diff>
--- a/Problem_Statement_ShoeScribe_AI.docx
+++ b/Problem_Statement_ShoeScribe_AI.docx
@@ -92,12 +92,6 @@
         <w:gridCol w:w="6960"/>
       </w:tblGrid>
       <w:tr>
-        <w:tblPrEx>
-          <w:tblCellMar>
-            <w:top w:w="0" w:type="dxa"/>
-            <w:bottom w:w="0" w:type="dxa"/>
-          </w:tblCellMar>
-        </w:tblPrEx>
         <w:tc>
           <w:tcPr>
             <w:tcW w:w="2400" w:type="dxa"/>
@@ -152,25 +146,7 @@
                 <w:sz w:val="20"/>
                 <w:szCs w:val="20"/>
               </w:rPr>
-              <w:t xml:space="preserve">Raman </w:t>
-            </w:r>
-            <w:proofErr w:type="gramStart"/>
-            <w:r>
-              <w:rPr>
-                <w:color w:val="1A1A2E"/>
-                <w:sz w:val="20"/>
-                <w:szCs w:val="20"/>
-              </w:rPr>
-              <w:t>Upadhyay  &amp;</w:t>
-            </w:r>
-            <w:proofErr w:type="gramEnd"/>
-            <w:r>
-              <w:rPr>
-                <w:color w:val="1A1A2E"/>
-                <w:sz w:val="20"/>
-                <w:szCs w:val="20"/>
-              </w:rPr>
-              <w:t xml:space="preserve">  S. Devanshu Murthy</w:t>
+              <w:t>Raman Upadhyay  &amp;  S. Devanshu Murthy</w:t>
             </w:r>
             <w:r>
               <w:rPr>
@@ -184,12 +160,6 @@
         </w:tc>
       </w:tr>
       <w:tr>
-        <w:tblPrEx>
-          <w:tblCellMar>
-            <w:top w:w="0" w:type="dxa"/>
-            <w:bottom w:w="0" w:type="dxa"/>
-          </w:tblCellMar>
-        </w:tblPrEx>
         <w:tc>
           <w:tcPr>
             <w:tcW w:w="2400" w:type="dxa"/>
@@ -264,16 +234,55 @@
               </w:rPr>
               <w:t>-AI</w:t>
             </w:r>
+            <w:r>
+              <w:rPr>
+                <w:color w:val="1A1A2E"/>
+                <w:sz w:val="20"/>
+                <w:szCs w:val="20"/>
+              </w:rPr>
+              <w:br/>
+              <w:t>github.com/</w:t>
+            </w:r>
+            <w:proofErr w:type="spellStart"/>
+            <w:r>
+              <w:rPr>
+                <w:color w:val="1A1A2E"/>
+                <w:sz w:val="20"/>
+                <w:szCs w:val="20"/>
+              </w:rPr>
+              <w:t>devanshumurthy</w:t>
+            </w:r>
+            <w:proofErr w:type="spellEnd"/>
+            <w:r>
+              <w:rPr>
+                <w:color w:val="1A1A2E"/>
+                <w:sz w:val="20"/>
+                <w:szCs w:val="20"/>
+              </w:rPr>
+              <w:t>/</w:t>
+            </w:r>
+            <w:proofErr w:type="spellStart"/>
+            <w:r>
+              <w:rPr>
+                <w:color w:val="1A1A2E"/>
+                <w:sz w:val="20"/>
+                <w:szCs w:val="20"/>
+              </w:rPr>
+              <w:t>ShoeScribe</w:t>
+            </w:r>
+            <w:proofErr w:type="spellEnd"/>
+            <w:r>
+              <w:rPr>
+                <w:color w:val="1A1A2E"/>
+                <w:sz w:val="20"/>
+                <w:szCs w:val="20"/>
+              </w:rPr>
+              <w:t>-AI</w:t>
+            </w:r>
           </w:p>
         </w:tc>
       </w:tr>
       <w:tr>
-        <w:tblPrEx>
-          <w:tblCellMar>
-            <w:top w:w="0" w:type="dxa"/>
-            <w:bottom w:w="0" w:type="dxa"/>
-          </w:tblCellMar>
-        </w:tblPrEx>
         <w:tc>
           <w:tcPr>
             <w:tcW w:w="2400" w:type="dxa"/>
@@ -334,12 +343,6 @@
         </w:tc>
       </w:tr>
       <w:tr>
-        <w:tblPrEx>
-          <w:tblCellMar>
-            <w:top w:w="0" w:type="dxa"/>
-            <w:bottom w:w="0" w:type="dxa"/>
-          </w:tblCellMar>
-        </w:tblPrEx>
         <w:tc>
           <w:tcPr>
             <w:tcW w:w="2400" w:type="dxa"/>
@@ -404,25 +407,25 @@
                 <w:sz w:val="20"/>
                 <w:szCs w:val="20"/>
               </w:rPr>
-              <w:t xml:space="preserve"> API (Llama 3.1 8</w:t>
-            </w:r>
-            <w:proofErr w:type="gramStart"/>
+              <w:t xml:space="preserve"> API (Llama 3.1 8B)  |  </w:t>
+            </w:r>
+            <w:proofErr w:type="spellStart"/>
             <w:r>
               <w:rPr>
                 <w:color w:val="1A1A2E"/>
                 <w:sz w:val="20"/>
                 <w:szCs w:val="20"/>
               </w:rPr>
-              <w:t>B)  |</w:t>
-            </w:r>
-            <w:proofErr w:type="gramEnd"/>
+              <w:t>Tavily</w:t>
+            </w:r>
+            <w:proofErr w:type="spellEnd"/>
             <w:r>
               <w:rPr>
                 <w:color w:val="1A1A2E"/>
                 <w:sz w:val="20"/>
                 <w:szCs w:val="20"/>
               </w:rPr>
-              <w:t xml:space="preserve">  </w:t>
+              <w:t xml:space="preserve"> Search  |  </w:t>
             </w:r>
             <w:proofErr w:type="spellStart"/>
             <w:r>
@@ -431,7 +434,7 @@
                 <w:sz w:val="20"/>
                 <w:szCs w:val="20"/>
               </w:rPr>
-              <w:t>Tavily</w:t>
+              <w:t>Streamlit</w:t>
             </w:r>
             <w:proofErr w:type="spellEnd"/>
             <w:r>
@@ -440,53 +443,7 @@
                 <w:sz w:val="20"/>
                 <w:szCs w:val="20"/>
               </w:rPr>
-              <w:t xml:space="preserve"> </w:t>
-            </w:r>
-            <w:proofErr w:type="gramStart"/>
-            <w:r>
-              <w:rPr>
-                <w:color w:val="1A1A2E"/>
-                <w:sz w:val="20"/>
-                <w:szCs w:val="20"/>
-              </w:rPr>
-              <w:t>Search  |</w:t>
-            </w:r>
-            <w:proofErr w:type="gramEnd"/>
-            <w:r>
-              <w:rPr>
-                <w:color w:val="1A1A2E"/>
-                <w:sz w:val="20"/>
-                <w:szCs w:val="20"/>
-              </w:rPr>
-              <w:t xml:space="preserve">  </w:t>
-            </w:r>
-            <w:proofErr w:type="spellStart"/>
-            <w:proofErr w:type="gramStart"/>
-            <w:r>
-              <w:rPr>
-                <w:color w:val="1A1A2E"/>
-                <w:sz w:val="20"/>
-                <w:szCs w:val="20"/>
-              </w:rPr>
-              <w:t>Streamlit</w:t>
-            </w:r>
-            <w:proofErr w:type="spellEnd"/>
-            <w:r>
-              <w:rPr>
-                <w:color w:val="1A1A2E"/>
-                <w:sz w:val="20"/>
-                <w:szCs w:val="20"/>
-              </w:rPr>
-              <w:t xml:space="preserve">  |</w:t>
-            </w:r>
-            <w:proofErr w:type="gramEnd"/>
-            <w:r>
-              <w:rPr>
-                <w:color w:val="1A1A2E"/>
-                <w:sz w:val="20"/>
-                <w:szCs w:val="20"/>
-              </w:rPr>
-              <w:t xml:space="preserve">  Railway</w:t>
+              <w:t xml:space="preserve">  |  Railway</w:t>
             </w:r>
           </w:p>
         </w:tc>
@@ -737,7 +694,6 @@
         <w:rPr>
           <w:color w:val="1A1A2E"/>
         </w:rPr>
-        <w:lastRenderedPageBreak/>
         <w:t>In all cases, the user's core need is the same: given a product name and category, produce a persuasive, accurate, and market-aware product description — quickly, reliably, and without manual research.</w:t>
       </w:r>
     </w:p>
@@ -809,12 +765,6 @@
         <w:gridCol w:w="5040"/>
       </w:tblGrid>
       <w:tr>
-        <w:tblPrEx>
-          <w:tblCellMar>
-            <w:top w:w="0" w:type="dxa"/>
-            <w:bottom w:w="0" w:type="dxa"/>
-          </w:tblCellMar>
-        </w:tblPrEx>
         <w:trPr>
           <w:tblHeader/>
         </w:trPr>
@@ -940,12 +890,6 @@
         </w:tc>
       </w:tr>
       <w:tr>
-        <w:tblPrEx>
-          <w:tblCellMar>
-            <w:top w:w="0" w:type="dxa"/>
-            <w:bottom w:w="0" w:type="dxa"/>
-          </w:tblCellMar>
-        </w:tblPrEx>
         <w:tc>
           <w:tcPr>
             <w:tcW w:w="520" w:type="dxa"/>
@@ -1077,12 +1021,6 @@
         </w:tc>
       </w:tr>
       <w:tr>
-        <w:tblPrEx>
-          <w:tblCellMar>
-            <w:top w:w="0" w:type="dxa"/>
-            <w:bottom w:w="0" w:type="dxa"/>
-          </w:tblCellMar>
-        </w:tblPrEx>
         <w:tc>
           <w:tcPr>
             <w:tcW w:w="520" w:type="dxa"/>
@@ -1214,12 +1152,6 @@
         </w:tc>
       </w:tr>
       <w:tr>
-        <w:tblPrEx>
-          <w:tblCellMar>
-            <w:top w:w="0" w:type="dxa"/>
-            <w:bottom w:w="0" w:type="dxa"/>
-          </w:tblCellMar>
-        </w:tblPrEx>
         <w:tc>
           <w:tcPr>
             <w:tcW w:w="520" w:type="dxa"/>
@@ -1351,12 +1283,6 @@
         </w:tc>
       </w:tr>
       <w:tr>
-        <w:tblPrEx>
-          <w:tblCellMar>
-            <w:top w:w="0" w:type="dxa"/>
-            <w:bottom w:w="0" w:type="dxa"/>
-          </w:tblCellMar>
-        </w:tblPrEx>
         <w:tc>
           <w:tcPr>
             <w:tcW w:w="520" w:type="dxa"/>
@@ -1924,73 +1850,7 @@
           <w:sz w:val="18"/>
           <w:szCs w:val="18"/>
         </w:rPr>
-        <w:t xml:space="preserve"> </w:t>
-      </w:r>
-      <w:proofErr w:type="gramStart"/>
-      <w:r>
-        <w:rPr>
-          <w:i/>
-          <w:iCs/>
-          <w:color w:val="6B7280"/>
-          <w:sz w:val="18"/>
-          <w:szCs w:val="18"/>
-        </w:rPr>
-        <w:t>AI  —</w:t>
-      </w:r>
-      <w:proofErr w:type="gramEnd"/>
-      <w:r>
-        <w:rPr>
-          <w:i/>
-          <w:iCs/>
-          <w:color w:val="6B7280"/>
-          <w:sz w:val="18"/>
-          <w:szCs w:val="18"/>
-        </w:rPr>
-        <w:t xml:space="preserve">  AI Agent Systems Design </w:t>
-      </w:r>
-      <w:proofErr w:type="gramStart"/>
-      <w:r>
-        <w:rPr>
-          <w:i/>
-          <w:iCs/>
-          <w:color w:val="6B7280"/>
-          <w:sz w:val="18"/>
-          <w:szCs w:val="18"/>
-        </w:rPr>
-        <w:t>Project  |</w:t>
-      </w:r>
-      <w:proofErr w:type="gramEnd"/>
-      <w:r>
-        <w:rPr>
-          <w:i/>
-          <w:iCs/>
-          <w:color w:val="6B7280"/>
-          <w:sz w:val="18"/>
-          <w:szCs w:val="18"/>
-        </w:rPr>
-        <w:t xml:space="preserve">  Raman Upadhyay &amp; S. Devanshu </w:t>
-      </w:r>
-      <w:proofErr w:type="gramStart"/>
-      <w:r>
-        <w:rPr>
-          <w:i/>
-          <w:iCs/>
-          <w:color w:val="6B7280"/>
-          <w:sz w:val="18"/>
-          <w:szCs w:val="18"/>
-        </w:rPr>
-        <w:t>Murthy  |</w:t>
-      </w:r>
-      <w:proofErr w:type="gramEnd"/>
-      <w:r>
-        <w:rPr>
-          <w:i/>
-          <w:iCs/>
-          <w:color w:val="6B7280"/>
-          <w:sz w:val="18"/>
-          <w:szCs w:val="18"/>
-        </w:rPr>
-        <w:t xml:space="preserve">  April 2026</w:t>
+        <w:t xml:space="preserve"> AI  —  AI Agent Systems Design Project  |  Raman Upadhyay &amp; S. Devanshu Murthy  |  April 2026</w:t>
       </w:r>
     </w:p>
     <w:sectPr>
@@ -2041,25 +1901,7 @@
         <w:sz w:val="16"/>
         <w:szCs w:val="16"/>
       </w:rPr>
-      <w:t xml:space="preserve">Raman </w:t>
-    </w:r>
-    <w:proofErr w:type="gramStart"/>
-    <w:r>
-      <w:rPr>
-        <w:color w:val="6B7280"/>
-        <w:sz w:val="16"/>
-        <w:szCs w:val="16"/>
-      </w:rPr>
-      <w:t>Upadhyay  &amp;</w:t>
-    </w:r>
-    <w:proofErr w:type="gramEnd"/>
-    <w:r>
-      <w:rPr>
-        <w:color w:val="6B7280"/>
-        <w:sz w:val="16"/>
-        <w:szCs w:val="16"/>
-      </w:rPr>
-      <w:t xml:space="preserve">  S. Devanshu Murthy</w:t>
+      <w:t>Raman Upadhyay  &amp;  S. Devanshu Murthy</w:t>
     </w:r>
     <w:r>
       <w:rPr>
@@ -2156,25 +1998,7 @@
         <w:sz w:val="18"/>
         <w:szCs w:val="18"/>
       </w:rPr>
-      <w:t xml:space="preserve"> </w:t>
-    </w:r>
-    <w:proofErr w:type="gramStart"/>
-    <w:r>
-      <w:rPr>
-        <w:color w:val="6B7280"/>
-        <w:sz w:val="18"/>
-        <w:szCs w:val="18"/>
-      </w:rPr>
-      <w:t>AI  |</w:t>
-    </w:r>
-    <w:proofErr w:type="gramEnd"/>
-    <w:r>
-      <w:rPr>
-        <w:color w:val="6B7280"/>
-        <w:sz w:val="18"/>
-        <w:szCs w:val="18"/>
-      </w:rPr>
-      <w:t xml:space="preserve">  Problem Statement</w:t>
+      <w:t xml:space="preserve"> AI  |  Problem Statement</w:t>
     </w:r>
     <w:r>
       <w:rPr>

</xml_diff>